<commit_message>
Soát lần cuối 29/10: 07.9, 07.10, 07.11 thống nhất cách nêu căn cứ
- 07.9 C.5.1: thay hai khả năng loại trừ nhau bằng đề nghị xác định
  từng nội dung của đơn tháng 5/2026 được phân loại thế nào; viện dẫn
  chung "chưa làm rõ căn cứ áp dụng tương ứng với từng loại đơn".
- 07.9 C.8.1: nêu việc Thông báo 5553 chưa thể hiện đối chiếu tài liệu
  của người tố cáo, không suy rộng hơn chứng cứ.
- 07.9: "chưa có văn bản" nghĩa là người lập chưa nhận được văn bản.
- 07.10: tách 05 hồ sơ đã qua mốc thời hạn cụ thể và 02 đơn kiến nghị
  (Điều 20 Thông tư 05 không ấn định số ngày) chỉ ghi số ngày chờ.
- 07.11: số liệu theo 07.10; đề nghị 2 ghi rõ kiểm tra trách nhiệm xử
  lý Đơn tố cáo gửi Chủ tịch UBND tỉnh.
Số trang giữ nguyên: 07.9 65 trang, 07.10 8 trang, 07.11 11 trang.

Co-Authored-By: Claude Opus 5.5 <noreply@anthropic.com>
Claude-Session: https://claude.ai/code/session_015JTqgRgcwweC4y1McBEsCj
</commit_message>
<xml_diff>
--- a/07.10 - Bang tong hop ho so qua han theo tung co quan.docx
+++ b/07.10 - Bang tong hop ho so qua han theo tung co quan.docx
@@ -2,7 +2,7 @@
 <file path=word/document.xml><?xml version="1.0" encoding="utf-8"?>
 <w:document xmlns:w="http://schemas.openxmlformats.org/wordprocessingml/2006/main" xmlns:m="http://schemas.openxmlformats.org/officeDocument/2006/math" xmlns:r="http://schemas.openxmlformats.org/officeDocument/2006/relationships" xmlns:o="urn:schemas-microsoft-com:office:office" xmlns:v="urn:schemas-microsoft-com:vml" xmlns:w10="urn:schemas-microsoft-com:office:word" xmlns:a="http://schemas.openxmlformats.org/drawingml/2006/main" xmlns:pic="http://schemas.openxmlformats.org/drawingml/2006/picture" xmlns:wp="http://schemas.openxmlformats.org/drawingml/2006/wordprocessingDrawing">
   <w:body>
-    <w:bookmarkStart w:id="31" w:name="X5afc80dc8359e8aa41231ffa4451d353af54716"/>
+    <w:bookmarkStart w:id="33" w:name="X5afc80dc8359e8aa41231ffa4451d353af54716"/>
     <w:p>
       <w:pPr>
         <w:pStyle w:val="Heading1"/>
@@ -477,7 +477,7 @@
               <w:rPr>
                 <w:sz w:val="22"/>
               </w:rPr>
-              <w:t xml:space="preserve">Số đơn, hồ sơ đã quá thời hạn luật định</w:t>
+              <w:t xml:space="preserve">Số đơn, hồ sơ đã qua mốc thời hạn luật định cụ thể</w:t>
             </w:r>
           </w:p>
         </w:tc>
@@ -499,7 +499,7 @@
                 <w:b/>
                 <w:sz w:val="22"/>
               </w:rPr>
-              <w:t xml:space="preserve">07</w:t>
+              <w:t xml:space="preserve">05</w:t>
             </w:r>
             <w:r>
               <w:rPr>
@@ -511,7 +511,66 @@
               <w:rPr>
                 <w:sz w:val="22"/>
               </w:rPr>
-              <w:t xml:space="preserve">(phần C)</w:t>
+              <w:t xml:space="preserve">(phần C.1)</w:t>
+            </w:r>
+          </w:p>
+        </w:tc>
+      </w:tr>
+      <w:tr>
+        <w:trPr>
+          <w:cantSplit/>
+        </w:trPr>
+        <w:tc>
+          <w:tcPr>
+            <w:tcW w:w="4536" w:type="dxa"/>
+            <w:vAlign w:val="top"/>
+          </w:tcPr>
+          <w:p>
+            <w:pPr>
+              <w:pStyle w:val="Compact"/>
+              <w:spacing w:before="20" w:after="20" w:line="252" w:lineRule="auto"/>
+              <w:ind w:firstLine="0"/>
+              <w:jc w:val="left"/>
+            </w:pPr>
+            <w:r>
+              <w:rPr>
+                <w:sz w:val="22"/>
+              </w:rPr>
+              <w:t xml:space="preserve">Số đơn kiến nghị chưa được trả lời, không có mốc ngày luật định cụ thể</w:t>
+            </w:r>
+          </w:p>
+        </w:tc>
+        <w:tc>
+          <w:tcPr>
+            <w:tcW w:w="4535" w:type="dxa"/>
+            <w:vAlign w:val="top"/>
+          </w:tcPr>
+          <w:p>
+            <w:pPr>
+              <w:pStyle w:val="Compact"/>
+              <w:spacing w:before="20" w:after="20" w:line="252" w:lineRule="auto"/>
+              <w:ind w:firstLine="0"/>
+              <w:jc w:val="left"/>
+            </w:pPr>
+            <w:r>
+              <w:rPr>
+                <w:bCs/>
+                <w:b/>
+                <w:sz w:val="22"/>
+              </w:rPr>
+              <w:t xml:space="preserve">02</w:t>
+            </w:r>
+            <w:r>
+              <w:rPr>
+                <w:sz w:val="22"/>
+              </w:rPr>
+              <w:t xml:space="preserve"> </w:t>
+            </w:r>
+            <w:r>
+              <w:rPr>
+                <w:sz w:val="22"/>
+              </w:rPr>
+              <w:t xml:space="preserve">(phần C.2)</w:t>
             </w:r>
           </w:p>
         </w:tc>
@@ -4856,22 +4915,31 @@
     </w:p>
     <w:bookmarkEnd w:id="26"/>
     <w:bookmarkEnd w:id="27"/>
-    <w:bookmarkStart w:id="28" w:name="X3aee19e575db99a2a705c44297b3e687c047d0c"/>
+    <w:bookmarkStart w:id="30" w:name="X4b9a5f44c6f67dd94f3a5391db207293b332186"/>
     <w:p>
       <w:pPr>
         <w:pStyle w:val="Heading2"/>
       </w:pPr>
       <w:r>
-        <w:t xml:space="preserve">C. Bảy đơn, hồ sơ đã quá thời hạn luật định</w:t>
+        <w:t xml:space="preserve">C. Đơn, hồ sơ đã qua mốc thời hạn, và đơn kiến nghị chờ lâu chưa được trả lời</w:t>
       </w:r>
     </w:p>
     <w:p>
       <w:pPr>
         <w:pStyle w:val="FirstParagraph"/>
+      </w:pPr>
+      <w:r>
+        <w:t xml:space="preserve">Rút từ bảng trên, xếp theo thứ tự cơ quan tại phần B.</w:t>
+      </w:r>
+    </w:p>
+    <w:bookmarkStart w:id="28" w:name="Xb022661ae807812099da683e7f8928f49fe708e"/>
+    <w:p>
+      <w:pPr>
+        <w:pStyle w:val="Heading3"/>
         <w:keepNext/>
       </w:pPr>
       <w:r>
-        <w:t xml:space="preserve">Rút từ bảng trên, xếp theo thứ tự cơ quan tại phần B:</w:t>
+        <w:t xml:space="preserve">C.1. Năm đơn, hồ sơ đã qua mốc thời hạn luật định cụ thể</w:t>
       </w:r>
     </w:p>
     <w:tbl>
@@ -4969,7 +5037,7 @@
                 <w:b/>
                 <w:sz w:val="22"/>
               </w:rPr>
-              <w:t xml:space="preserve">Hạn luật định</w:t>
+              <w:t xml:space="preserve">Mốc luật định</w:t>
             </w:r>
           </w:p>
         </w:tc>
@@ -4991,7 +5059,7 @@
                 <w:b/>
                 <w:sz w:val="22"/>
               </w:rPr>
-              <w:t xml:space="preserve">Quá hạn đến 28/10/2026</w:t>
+              <w:t xml:space="preserve">Đã qua mốc, đến 28/10/2026</w:t>
             </w:r>
           </w:p>
         </w:tc>
@@ -5103,7 +5171,7 @@
               <w:rPr>
                 <w:sz w:val="22"/>
               </w:rPr>
-              <w:t xml:space="preserve">Giám đốc Sở GD&amp;ĐT</w:t>
+              <w:t xml:space="preserve">UBND phường Phan Thiết</w:t>
             </w:r>
           </w:p>
         </w:tc>
@@ -5123,7 +5191,7 @@
               <w:rPr>
                 <w:sz w:val="22"/>
               </w:rPr>
-              <w:t xml:space="preserve">Đơn C – thẩm định chuyên môn</w:t>
+              <w:t xml:space="preserve">Hồ sơ do Công văn 1436 chuyển</w:t>
             </w:r>
           </w:p>
         </w:tc>
@@ -5143,7 +5211,7 @@
               <w:rPr>
                 <w:sz w:val="22"/>
               </w:rPr>
-              <w:t xml:space="preserve">theo Điều 20 TT 05/2021</w:t>
+              <w:t xml:space="preserve">02/6/2026 (tối đa 05/6)</w:t>
             </w:r>
           </w:p>
         </w:tc>
@@ -5161,11 +5229,23 @@
             </w:pPr>
             <w:r>
               <w:rPr>
+                <w:sz w:val="22"/>
+              </w:rPr>
+              <w:t xml:space="preserve">Văn bản đầu tiên ra ngày 28/8/2026,</w:t>
+            </w:r>
+            <w:r>
+              <w:rPr>
+                <w:sz w:val="22"/>
+              </w:rPr>
+              <w:t xml:space="preserve"> </w:t>
+            </w:r>
+            <w:r>
+              <w:rPr>
                 <w:bCs/>
                 <w:b/>
                 <w:sz w:val="22"/>
               </w:rPr>
-              <w:t xml:space="preserve">165 ngày</w:t>
+              <w:t xml:space="preserve">chậm 84 ngày</w:t>
             </w:r>
             <w:r>
               <w:rPr>
@@ -5177,7 +5257,7 @@
               <w:rPr>
                 <w:sz w:val="22"/>
               </w:rPr>
-              <w:t xml:space="preserve">kể từ ngày nhận</w:t>
+              <w:t xml:space="preserve">so với mốc tối đa</w:t>
             </w:r>
           </w:p>
         </w:tc>
@@ -5222,7 +5302,7 @@
               <w:rPr>
                 <w:sz w:val="22"/>
               </w:rPr>
-              <w:t xml:space="preserve">Hồ sơ do Công văn 1436 chuyển</w:t>
+              <w:t xml:space="preserve">Hồ sơ tố cáo nhận 09/7/2026</w:t>
             </w:r>
           </w:p>
         </w:tc>
@@ -5242,7 +5322,7 @@
               <w:rPr>
                 <w:sz w:val="22"/>
               </w:rPr>
-              <w:t xml:space="preserve">02/6/2026 (tối đa 05/6)</w:t>
+              <w:t xml:space="preserve">23/7/2026</w:t>
             </w:r>
           </w:p>
         </w:tc>
@@ -5260,35 +5340,11 @@
             </w:pPr>
             <w:r>
               <w:rPr>
-                <w:sz w:val="22"/>
-              </w:rPr>
-              <w:t xml:space="preserve">Văn bản đầu tiên ra ngày 28/8/2026,</w:t>
-            </w:r>
-            <w:r>
-              <w:rPr>
-                <w:sz w:val="22"/>
-              </w:rPr>
-              <w:t xml:space="preserve"> </w:t>
-            </w:r>
-            <w:r>
-              <w:rPr>
                 <w:bCs/>
                 <w:b/>
                 <w:sz w:val="22"/>
               </w:rPr>
-              <w:t xml:space="preserve">chậm 84 ngày</w:t>
-            </w:r>
-            <w:r>
-              <w:rPr>
-                <w:sz w:val="22"/>
-              </w:rPr>
-              <w:t xml:space="preserve"> </w:t>
-            </w:r>
-            <w:r>
-              <w:rPr>
-                <w:sz w:val="22"/>
-              </w:rPr>
-              <w:t xml:space="preserve">so với mốc tối đa</w:t>
+              <w:t xml:space="preserve">97 ngày</w:t>
             </w:r>
           </w:p>
         </w:tc>
@@ -5333,7 +5389,7 @@
               <w:rPr>
                 <w:sz w:val="22"/>
               </w:rPr>
-              <w:t xml:space="preserve">Hồ sơ tố cáo nhận 09/7/2026</w:t>
+              <w:t xml:space="preserve">Đơn khiếu nại nhận 06/10/2026</w:t>
             </w:r>
           </w:p>
         </w:tc>
@@ -5353,7 +5409,7 @@
               <w:rPr>
                 <w:sz w:val="22"/>
               </w:rPr>
-              <w:t xml:space="preserve">23/7/2026</w:t>
+              <w:t xml:space="preserve">15/10/2026 (khiếu nại thuộc thẩm quyền, đủ điều kiện thụ lý)</w:t>
             </w:r>
           </w:p>
         </w:tc>
@@ -5375,7 +5431,7 @@
                 <w:b/>
                 <w:sz w:val="22"/>
               </w:rPr>
-              <w:t xml:space="preserve">97 ngày</w:t>
+              <w:t xml:space="preserve">09 ngày làm việc</w:t>
             </w:r>
           </w:p>
         </w:tc>
@@ -5400,7 +5456,7 @@
               <w:rPr>
                 <w:sz w:val="22"/>
               </w:rPr>
-              <w:t xml:space="preserve">UBND phường Phan Thiết</w:t>
+              <w:t xml:space="preserve">Chủ tịch UBND tỉnh Lâm Đồng</w:t>
             </w:r>
           </w:p>
         </w:tc>
@@ -5420,7 +5476,7 @@
               <w:rPr>
                 <w:sz w:val="22"/>
               </w:rPr>
-              <w:t xml:space="preserve">Đơn khiếu nại nhận 06/10/2026</w:t>
+              <w:t xml:space="preserve">Đơn tố cáo nhận 17/9/2026</w:t>
             </w:r>
           </w:p>
         </w:tc>
@@ -5440,7 +5496,7 @@
               <w:rPr>
                 <w:sz w:val="22"/>
               </w:rPr>
-              <w:t xml:space="preserve">15/10/2026</w:t>
+              <w:t xml:space="preserve">01/10/2026</w:t>
             </w:r>
           </w:p>
         </w:tc>
@@ -5462,7 +5518,149 @@
                 <w:b/>
                 <w:sz w:val="22"/>
               </w:rPr>
-              <w:t xml:space="preserve">09 ngày làm việc</w:t>
+              <w:t xml:space="preserve">27 ngày</w:t>
+            </w:r>
+          </w:p>
+        </w:tc>
+      </w:tr>
+    </w:tbl>
+    <w:bookmarkEnd w:id="28"/>
+    <w:bookmarkStart w:id="29" w:name="Xa936a15b354d6fa0b1e124cf08220e0b8e3b7d9"/>
+    <w:p>
+      <w:pPr>
+        <w:pStyle w:val="Heading3"/>
+      </w:pPr>
+      <w:r>
+        <w:t xml:space="preserve">C.2. Hai đơn kiến nghị chưa được trả lời sau thời gian dài</w:t>
+      </w:r>
+    </w:p>
+    <w:p>
+      <w:pPr>
+        <w:pStyle w:val="FirstParagraph"/>
+        <w:keepNext/>
+      </w:pPr>
+      <w:r>
+        <w:t xml:space="preserve">Điều 20 Thông tư số 05/2021/TT-TTCP quy định trách nhiệm giải quyết, trả lời hoặc chuyển đơn kiến nghị, phản ánh, nhưng không ấn định một số ngày cụ thể; hai dòng dưới đây ghi số ngày chờ, không tính số ngày quá hạn.</w:t>
+      </w:r>
+    </w:p>
+    <w:tbl>
+      <w:tblPr>
+        <w:tblStyle w:val="Table"/>
+        <w:tblW w:type="dxa" w:w="9071"/>
+        <w:jc w:val="center"/>
+        <w:tblBorders>
+          <w:top w:val="single" w:sz="4" w:space="0" w:color="000000"/>
+          <w:left w:val="single" w:sz="4" w:space="0" w:color="000000"/>
+          <w:bottom w:val="single" w:sz="4" w:space="0" w:color="000000"/>
+          <w:right w:val="single" w:sz="4" w:space="0" w:color="000000"/>
+          <w:insideH w:val="single" w:sz="4" w:space="0" w:color="000000"/>
+          <w:insideV w:val="single" w:sz="4" w:space="0" w:color="000000"/>
+        </w:tblBorders>
+        <w:tblLayout w:type="fixed"/>
+        <w:tblCellMar>
+          <w:top w:w="40" w:type="dxa"/>
+          <w:left w:w="85" w:type="dxa"/>
+          <w:bottom w:w="40" w:type="dxa"/>
+          <w:right w:w="85" w:type="dxa"/>
+        </w:tblCellMar>
+        <w:tblLook w:firstRow="1" w:lastRow="0" w:firstColumn="0" w:lastColumn="0" w:noHBand="0" w:noVBand="0" w:val="0020"/>
+      </w:tblPr>
+      <w:tblGrid>
+        <w:gridCol w:w="2268"/>
+        <w:gridCol w:w="2268"/>
+        <w:gridCol w:w="2268"/>
+        <w:gridCol w:w="2267"/>
+      </w:tblGrid>
+      <w:tr>
+        <w:trPr>
+          <w:cantSplit/>
+          <w:tblHeader w:val="true"/>
+        </w:trPr>
+        <w:tc>
+          <w:tcPr>
+            <w:tcW w:w="2268" w:type="dxa"/>
+            <w:shd w:val="clear" w:color="auto" w:fill="E7E6E6"/>
+            <w:vAlign w:val="center"/>
+          </w:tcPr>
+          <w:p>
+            <w:pPr>
+              <w:pStyle w:val="Compact"/>
+              <w:spacing w:before="20" w:after="20" w:line="252" w:lineRule="auto"/>
+              <w:ind w:firstLine="0"/>
+              <w:jc w:val="center"/>
+            </w:pPr>
+            <w:r>
+              <w:rPr>
+                <w:b/>
+                <w:sz w:val="22"/>
+              </w:rPr>
+              <w:t xml:space="preserve">Cơ quan</w:t>
+            </w:r>
+          </w:p>
+        </w:tc>
+        <w:tc>
+          <w:tcPr>
+            <w:tcW w:w="2268" w:type="dxa"/>
+            <w:shd w:val="clear" w:color="auto" w:fill="E7E6E6"/>
+            <w:vAlign w:val="center"/>
+          </w:tcPr>
+          <w:p>
+            <w:pPr>
+              <w:pStyle w:val="Compact"/>
+              <w:spacing w:before="20" w:after="20" w:line="252" w:lineRule="auto"/>
+              <w:ind w:firstLine="0"/>
+              <w:jc w:val="center"/>
+            </w:pPr>
+            <w:r>
+              <w:rPr>
+                <w:b/>
+                <w:sz w:val="22"/>
+              </w:rPr>
+              <w:t xml:space="preserve">Hồ sơ</w:t>
+            </w:r>
+          </w:p>
+        </w:tc>
+        <w:tc>
+          <w:tcPr>
+            <w:tcW w:w="2268" w:type="dxa"/>
+            <w:shd w:val="clear" w:color="auto" w:fill="E7E6E6"/>
+            <w:vAlign w:val="center"/>
+          </w:tcPr>
+          <w:p>
+            <w:pPr>
+              <w:pStyle w:val="Compact"/>
+              <w:spacing w:before="20" w:after="20" w:line="252" w:lineRule="auto"/>
+              <w:ind w:firstLine="0"/>
+              <w:jc w:val="center"/>
+            </w:pPr>
+            <w:r>
+              <w:rPr>
+                <w:b/>
+                <w:sz w:val="22"/>
+              </w:rPr>
+              <w:t xml:space="preserve">Căn cứ</w:t>
+            </w:r>
+          </w:p>
+        </w:tc>
+        <w:tc>
+          <w:tcPr>
+            <w:tcW w:w="2267" w:type="dxa"/>
+            <w:shd w:val="clear" w:color="auto" w:fill="E7E6E6"/>
+            <w:vAlign w:val="center"/>
+          </w:tcPr>
+          <w:p>
+            <w:pPr>
+              <w:pStyle w:val="Compact"/>
+              <w:spacing w:before="20" w:after="20" w:line="252" w:lineRule="auto"/>
+              <w:ind w:firstLine="0"/>
+              <w:jc w:val="center"/>
+            </w:pPr>
+            <w:r>
+              <w:rPr>
+                <w:b/>
+                <w:sz w:val="22"/>
+              </w:rPr>
+              <w:t xml:space="preserve">Số ngày chờ, đến 28/10/2026</w:t>
             </w:r>
           </w:p>
         </w:tc>
@@ -5487,7 +5685,7 @@
               <w:rPr>
                 <w:sz w:val="22"/>
               </w:rPr>
-              <w:t xml:space="preserve">Chủ tịch UBND tỉnh Lâm Đồng</w:t>
+              <w:t xml:space="preserve">Giám đốc Sở GD&amp;ĐT</w:t>
             </w:r>
           </w:p>
         </w:tc>
@@ -5507,7 +5705,7 @@
               <w:rPr>
                 <w:sz w:val="22"/>
               </w:rPr>
-              <w:t xml:space="preserve">Đơn tố cáo nhận 17/9/2026</w:t>
+              <w:t xml:space="preserve">Đơn C – thẩm định chuyên môn khẩn cấp</w:t>
             </w:r>
           </w:p>
         </w:tc>
@@ -5527,7 +5725,7 @@
               <w:rPr>
                 <w:sz w:val="22"/>
               </w:rPr>
-              <w:t xml:space="preserve">01/10/2026</w:t>
+              <w:t xml:space="preserve">Điều 20 TT 05/2021</w:t>
             </w:r>
           </w:p>
         </w:tc>
@@ -5549,7 +5747,19 @@
                 <w:b/>
                 <w:sz w:val="22"/>
               </w:rPr>
-              <w:t xml:space="preserve">27 ngày</w:t>
+              <w:t xml:space="preserve">165 ngày</w:t>
+            </w:r>
+            <w:r>
+              <w:rPr>
+                <w:sz w:val="22"/>
+              </w:rPr>
+              <w:t xml:space="preserve"> </w:t>
+            </w:r>
+            <w:r>
+              <w:rPr>
+                <w:sz w:val="22"/>
+              </w:rPr>
+              <w:t xml:space="preserve">kể từ ngày nhận</w:t>
             </w:r>
           </w:p>
         </w:tc>
@@ -5614,7 +5824,7 @@
               <w:rPr>
                 <w:sz w:val="22"/>
               </w:rPr>
-              <w:t xml:space="preserve">theo Điều 20 TT 05/2021</w:t>
+              <w:t xml:space="preserve">Điều 20 TT 05/2021</w:t>
             </w:r>
           </w:p>
         </w:tc>
@@ -5664,8 +5874,9 @@
         </w:pict>
       </w:r>
     </w:p>
-    <w:bookmarkEnd w:id="28"/>
-    <w:bookmarkStart w:id="29" w:name="d.-ba-việc-đến-nay-chưa-được-thực-hiện"/>
+    <w:bookmarkEnd w:id="29"/>
+    <w:bookmarkEnd w:id="30"/>
+    <w:bookmarkStart w:id="31" w:name="d.-ba-việc-đến-nay-chưa-được-thực-hiện"/>
     <w:p>
       <w:pPr>
         <w:pStyle w:val="Heading2"/>
@@ -5870,8 +6081,8 @@
         </w:pict>
       </w:r>
     </w:p>
-    <w:bookmarkEnd w:id="29"/>
-    <w:bookmarkStart w:id="30" w:name="e.-nguồn-đối-chiếu"/>
+    <w:bookmarkEnd w:id="31"/>
+    <w:bookmarkStart w:id="32" w:name="e.-nguồn-đối-chiếu"/>
     <w:p>
       <w:pPr>
         <w:pStyle w:val="Heading2"/>
@@ -6002,8 +6213,8 @@
         <w:t xml:space="preserve">Người lập — Trần Duy Tuệ · 28/10/2026</w:t>
       </w:r>
     </w:p>
-    <w:bookmarkEnd w:id="30"/>
-    <w:bookmarkEnd w:id="31"/>
+    <w:bookmarkEnd w:id="32"/>
+    <w:bookmarkEnd w:id="33"/>
     <w:sectPr>
       <w:footerReference r:id="rId9" w:type="default"/>
       <w:pgSz w:h="16838" w:w="11906"/>

</xml_diff>